<commit_message>
updated notecards and week 9 courseprep
</commit_message>
<xml_diff>
--- a/R Resources/weeks5_6_7_notecards.docx
+++ b/R Resources/weeks5_6_7_notecards.docx
@@ -72,11 +72,33 @@
                 <w:rFonts w:ascii="Courier New" w:hAnsi="Courier New" w:cs="Courier New"/>
               </w:rPr>
             </w:pPr>
-            <w:r>
-              <w:rPr>
-                <w:rFonts w:ascii="Courier New" w:hAnsi="Courier New" w:cs="Courier New"/>
-              </w:rPr>
-              <w:t xml:space="preserve">t_test(x = </w:t>
+            <w:proofErr w:type="spellStart"/>
+            <w:r>
+              <w:rPr>
+                <w:rFonts w:ascii="Courier New" w:hAnsi="Courier New" w:cs="Courier New"/>
+              </w:rPr>
+              <w:t>t_</w:t>
+            </w:r>
+            <w:proofErr w:type="gramStart"/>
+            <w:r>
+              <w:rPr>
+                <w:rFonts w:ascii="Courier New" w:hAnsi="Courier New" w:cs="Courier New"/>
+              </w:rPr>
+              <w:t>test</w:t>
+            </w:r>
+            <w:proofErr w:type="spellEnd"/>
+            <w:r>
+              <w:rPr>
+                <w:rFonts w:ascii="Courier New" w:hAnsi="Courier New" w:cs="Courier New"/>
+              </w:rPr>
+              <w:t>(</w:t>
+            </w:r>
+            <w:proofErr w:type="gramEnd"/>
+            <w:r>
+              <w:rPr>
+                <w:rFonts w:ascii="Courier New" w:hAnsi="Courier New" w:cs="Courier New"/>
+              </w:rPr>
+              <w:t xml:space="preserve">x = </w:t>
             </w:r>
             <w:r>
               <w:rPr>
@@ -188,7 +210,21 @@
               <w:rPr>
                 <w:rFonts w:ascii="Courier New" w:hAnsi="Courier New" w:cs="Courier New"/>
               </w:rPr>
-              <w:t xml:space="preserve">       conf_int = </w:t>
+              <w:t xml:space="preserve">       </w:t>
+            </w:r>
+            <w:proofErr w:type="spellStart"/>
+            <w:r>
+              <w:rPr>
+                <w:rFonts w:ascii="Courier New" w:hAnsi="Courier New" w:cs="Courier New"/>
+              </w:rPr>
+              <w:t>conf_int</w:t>
+            </w:r>
+            <w:proofErr w:type="spellEnd"/>
+            <w:r>
+              <w:rPr>
+                <w:rFonts w:ascii="Courier New" w:hAnsi="Courier New" w:cs="Courier New"/>
+              </w:rPr>
+              <w:t xml:space="preserve"> = </w:t>
             </w:r>
             <w:r>
               <w:rPr>
@@ -213,7 +249,14 @@
               <w:rPr>
                 <w:rFonts w:ascii="Courier New" w:hAnsi="Courier New" w:cs="Courier New"/>
               </w:rPr>
-              <w:t xml:space="preserve">       conf</w:t>
+              <w:t xml:space="preserve">       </w:t>
+            </w:r>
+            <w:proofErr w:type="spellStart"/>
+            <w:r>
+              <w:rPr>
+                <w:rFonts w:ascii="Courier New" w:hAnsi="Courier New" w:cs="Courier New"/>
+              </w:rPr>
+              <w:t>conf</w:t>
             </w:r>
             <w:r>
               <w:rPr>
@@ -225,7 +268,14 @@
               <w:rPr>
                 <w:rFonts w:ascii="Courier New" w:hAnsi="Courier New" w:cs="Courier New"/>
               </w:rPr>
-              <w:t xml:space="preserve">level = </w:t>
+              <w:t>level</w:t>
+            </w:r>
+            <w:proofErr w:type="spellEnd"/>
+            <w:r>
+              <w:rPr>
+                <w:rFonts w:ascii="Courier New" w:hAnsi="Courier New" w:cs="Courier New"/>
+              </w:rPr>
+              <w:t xml:space="preserve"> = </w:t>
             </w:r>
             <w:r>
               <w:rPr>
@@ -304,6 +354,7 @@
             <w:r>
               <w:t xml:space="preserve">If you want a 95% confidence interval, you change </w:t>
             </w:r>
+            <w:proofErr w:type="spellStart"/>
             <w:r>
               <w:rPr>
                 <w:rFonts w:ascii="Courier New" w:hAnsi="Courier New" w:cs="Courier New"/>
@@ -313,6 +364,7 @@
               </w:rPr>
               <w:t>conf_level</w:t>
             </w:r>
+            <w:proofErr w:type="spellEnd"/>
             <w:r>
               <w:rPr>
                 <w:color w:val="0070C0"/>
@@ -496,7 +548,21 @@
               <w:rPr>
                 <w:rFonts w:ascii="Courier New" w:hAnsi="Courier New" w:cs="Courier New"/>
               </w:rPr>
-              <w:t xml:space="preserve">  specify(response = </w:t>
+              <w:t xml:space="preserve">  </w:t>
+            </w:r>
+            <w:proofErr w:type="gramStart"/>
+            <w:r>
+              <w:rPr>
+                <w:rFonts w:ascii="Courier New" w:hAnsi="Courier New" w:cs="Courier New"/>
+              </w:rPr>
+              <w:t>specify(</w:t>
+            </w:r>
+            <w:proofErr w:type="gramEnd"/>
+            <w:r>
+              <w:rPr>
+                <w:rFonts w:ascii="Courier New" w:hAnsi="Courier New" w:cs="Courier New"/>
+              </w:rPr>
+              <w:t xml:space="preserve">response = </w:t>
             </w:r>
             <w:r>
               <w:rPr>
@@ -583,7 +649,21 @@
               <w:rPr>
                 <w:rFonts w:ascii="Courier New" w:hAnsi="Courier New" w:cs="Courier New"/>
               </w:rPr>
-              <w:t xml:space="preserve">  generate(reps = </w:t>
+              <w:t xml:space="preserve">  </w:t>
+            </w:r>
+            <w:proofErr w:type="gramStart"/>
+            <w:r>
+              <w:rPr>
+                <w:rFonts w:ascii="Courier New" w:hAnsi="Courier New" w:cs="Courier New"/>
+              </w:rPr>
+              <w:t>generate(</w:t>
+            </w:r>
+            <w:proofErr w:type="gramEnd"/>
+            <w:r>
+              <w:rPr>
+                <w:rFonts w:ascii="Courier New" w:hAnsi="Courier New" w:cs="Courier New"/>
+              </w:rPr>
+              <w:t xml:space="preserve">reps = </w:t>
             </w:r>
             <w:r>
               <w:rPr>
@@ -608,7 +688,21 @@
               <w:rPr>
                 <w:rFonts w:ascii="Courier New" w:hAnsi="Courier New" w:cs="Courier New"/>
               </w:rPr>
-              <w:t xml:space="preserve">  calculate(stat = "</w:t>
+              <w:t xml:space="preserve">  </w:t>
+            </w:r>
+            <w:proofErr w:type="gramStart"/>
+            <w:r>
+              <w:rPr>
+                <w:rFonts w:ascii="Courier New" w:hAnsi="Courier New" w:cs="Courier New"/>
+              </w:rPr>
+              <w:t>calculate(</w:t>
+            </w:r>
+            <w:proofErr w:type="gramEnd"/>
+            <w:r>
+              <w:rPr>
+                <w:rFonts w:ascii="Courier New" w:hAnsi="Courier New" w:cs="Courier New"/>
+              </w:rPr>
+              <w:t>stat = "</w:t>
             </w:r>
             <w:r>
               <w:rPr>
@@ -651,8 +745,16 @@
               <w:rPr>
                 <w:rFonts w:ascii="Courier New" w:hAnsi="Courier New" w:cs="Courier New"/>
               </w:rPr>
-              <w:t xml:space="preserve">            order = c(</w:t>
-            </w:r>
+              <w:t xml:space="preserve">            order = </w:t>
+            </w:r>
+            <w:proofErr w:type="gramStart"/>
+            <w:r>
+              <w:rPr>
+                <w:rFonts w:ascii="Courier New" w:hAnsi="Courier New" w:cs="Courier New"/>
+              </w:rPr>
+              <w:t>c(</w:t>
+            </w:r>
+            <w:proofErr w:type="gramEnd"/>
             <w:r>
               <w:rPr>
                 <w:rFonts w:ascii="Courier New" w:hAnsi="Courier New" w:cs="Courier New"/>
@@ -759,7 +861,15 @@
               <w:t xml:space="preserve">The </w:t>
             </w:r>
             <w:r>
-              <w:t>quotation marks in the c() function are important! They need to be there even after you replace the values!</w:t>
+              <w:t xml:space="preserve">quotation marks in the </w:t>
+            </w:r>
+            <w:proofErr w:type="gramStart"/>
+            <w:r>
+              <w:t>c(</w:t>
+            </w:r>
+            <w:proofErr w:type="gramEnd"/>
+            <w:r>
+              <w:t>) function are important! They need to be there even after you replace the values!</w:t>
             </w:r>
           </w:p>
           <w:p>
@@ -862,12 +972,21 @@
                 <w:color w:val="000000" w:themeColor="text1"/>
               </w:rPr>
             </w:pPr>
+            <w:proofErr w:type="gramStart"/>
             <w:r>
               <w:rPr>
                 <w:rFonts w:ascii="Courier New" w:hAnsi="Courier New" w:cs="Courier New"/>
                 <w:color w:val="000000" w:themeColor="text1"/>
               </w:rPr>
-              <w:t xml:space="preserve">visualize(data = bootstrap, </w:t>
+              <w:t>visualize(</w:t>
+            </w:r>
+            <w:proofErr w:type="gramEnd"/>
+            <w:r>
+              <w:rPr>
+                <w:rFonts w:ascii="Courier New" w:hAnsi="Courier New" w:cs="Courier New"/>
+                <w:color w:val="000000" w:themeColor="text1"/>
+              </w:rPr>
+              <w:t xml:space="preserve">data = bootstrap, </w:t>
             </w:r>
           </w:p>
           <w:p>
@@ -1060,6 +1179,7 @@
                 <w:rFonts w:ascii="Courier New" w:hAnsi="Courier New" w:cs="Courier New"/>
               </w:rPr>
             </w:pPr>
+            <w:proofErr w:type="spellStart"/>
             <w:r>
               <w:rPr>
                 <w:rFonts w:ascii="Courier New" w:hAnsi="Courier New" w:cs="Courier New"/>
@@ -1088,6 +1208,7 @@
               </w:rPr>
               <w:t>s</w:t>
             </w:r>
+            <w:proofErr w:type="spellEnd"/>
             <w:r>
               <w:rPr>
                 <w:rFonts w:ascii="Courier New" w:hAnsi="Courier New" w:cs="Courier New"/>
@@ -1128,11 +1249,19 @@
               </w:rPr>
               <w:t xml:space="preserve">  </w:t>
             </w:r>
-            <w:r>
-              <w:rPr>
-                <w:rFonts w:ascii="Courier New" w:hAnsi="Courier New" w:cs="Courier New"/>
-              </w:rPr>
-              <w:t xml:space="preserve">specify(response = </w:t>
+            <w:proofErr w:type="gramStart"/>
+            <w:r>
+              <w:rPr>
+                <w:rFonts w:ascii="Courier New" w:hAnsi="Courier New" w:cs="Courier New"/>
+              </w:rPr>
+              <w:t>specify(</w:t>
+            </w:r>
+            <w:proofErr w:type="gramEnd"/>
+            <w:r>
+              <w:rPr>
+                <w:rFonts w:ascii="Courier New" w:hAnsi="Courier New" w:cs="Courier New"/>
+              </w:rPr>
+              <w:t xml:space="preserve">response = </w:t>
             </w:r>
             <w:r>
               <w:rPr>
@@ -1228,11 +1357,19 @@
               </w:rPr>
               <w:t xml:space="preserve">  </w:t>
             </w:r>
-            <w:r>
-              <w:rPr>
-                <w:rFonts w:ascii="Courier New" w:hAnsi="Courier New" w:cs="Courier New"/>
-              </w:rPr>
-              <w:t>calculate(stat = "</w:t>
+            <w:proofErr w:type="gramStart"/>
+            <w:r>
+              <w:rPr>
+                <w:rFonts w:ascii="Courier New" w:hAnsi="Courier New" w:cs="Courier New"/>
+              </w:rPr>
+              <w:t>calculate(</w:t>
+            </w:r>
+            <w:proofErr w:type="gramEnd"/>
+            <w:r>
+              <w:rPr>
+                <w:rFonts w:ascii="Courier New" w:hAnsi="Courier New" w:cs="Courier New"/>
+              </w:rPr>
+              <w:t>stat = "</w:t>
             </w:r>
             <w:r>
               <w:rPr>
@@ -1275,8 +1412,16 @@
               <w:rPr>
                 <w:rFonts w:ascii="Courier New" w:hAnsi="Courier New" w:cs="Courier New"/>
               </w:rPr>
-              <w:t xml:space="preserve">            order = c(</w:t>
-            </w:r>
+              <w:t xml:space="preserve">            order = </w:t>
+            </w:r>
+            <w:proofErr w:type="gramStart"/>
+            <w:r>
+              <w:rPr>
+                <w:rFonts w:ascii="Courier New" w:hAnsi="Courier New" w:cs="Courier New"/>
+              </w:rPr>
+              <w:t>c(</w:t>
+            </w:r>
+            <w:proofErr w:type="gramEnd"/>
             <w:r>
               <w:rPr>
                 <w:rFonts w:ascii="Courier New" w:hAnsi="Courier New" w:cs="Courier New"/>
@@ -1399,8 +1544,17 @@
                 <w:i/>
                 <w:iCs/>
               </w:rPr>
-              <w:t>be done</w:t>
-            </w:r>
+              <w:t xml:space="preserve">be </w:t>
+            </w:r>
+            <w:proofErr w:type="gramStart"/>
+            <w:r>
+              <w:rPr>
+                <w:i/>
+                <w:iCs/>
+              </w:rPr>
+              <w:t>done</w:t>
+            </w:r>
+            <w:proofErr w:type="gramEnd"/>
             <w:r>
               <w:rPr>
                 <w:b/>
@@ -1486,11 +1640,33 @@
                 <w:rFonts w:ascii="Courier New" w:hAnsi="Courier New" w:cs="Courier New"/>
               </w:rPr>
             </w:pPr>
-            <w:r>
-              <w:rPr>
-                <w:rFonts w:ascii="Courier New" w:hAnsi="Courier New" w:cs="Courier New"/>
-              </w:rPr>
-              <w:t xml:space="preserve">get_confidence_interval(x = bootstrap, </w:t>
+            <w:proofErr w:type="spellStart"/>
+            <w:r>
+              <w:rPr>
+                <w:rFonts w:ascii="Courier New" w:hAnsi="Courier New" w:cs="Courier New"/>
+              </w:rPr>
+              <w:t>get_confidence_</w:t>
+            </w:r>
+            <w:proofErr w:type="gramStart"/>
+            <w:r>
+              <w:rPr>
+                <w:rFonts w:ascii="Courier New" w:hAnsi="Courier New" w:cs="Courier New"/>
+              </w:rPr>
+              <w:t>interval</w:t>
+            </w:r>
+            <w:proofErr w:type="spellEnd"/>
+            <w:r>
+              <w:rPr>
+                <w:rFonts w:ascii="Courier New" w:hAnsi="Courier New" w:cs="Courier New"/>
+              </w:rPr>
+              <w:t>(</w:t>
+            </w:r>
+            <w:proofErr w:type="gramEnd"/>
+            <w:r>
+              <w:rPr>
+                <w:rFonts w:ascii="Courier New" w:hAnsi="Courier New" w:cs="Courier New"/>
+              </w:rPr>
+              <w:t xml:space="preserve">x = bootstrap, </w:t>
             </w:r>
           </w:p>
           <w:p>
@@ -1542,7 +1718,35 @@
               <w:rPr>
                 <w:rFonts w:ascii="Courier New" w:hAnsi="Courier New" w:cs="Courier New"/>
               </w:rPr>
-              <w:t xml:space="preserve">                        point_estimate = obs_mean)</w:t>
+              <w:t xml:space="preserve">                        </w:t>
+            </w:r>
+            <w:proofErr w:type="spellStart"/>
+            <w:r>
+              <w:rPr>
+                <w:rFonts w:ascii="Courier New" w:hAnsi="Courier New" w:cs="Courier New"/>
+              </w:rPr>
+              <w:t>point_estimate</w:t>
+            </w:r>
+            <w:proofErr w:type="spellEnd"/>
+            <w:r>
+              <w:rPr>
+                <w:rFonts w:ascii="Courier New" w:hAnsi="Courier New" w:cs="Courier New"/>
+              </w:rPr>
+              <w:t xml:space="preserve"> = </w:t>
+            </w:r>
+            <w:proofErr w:type="spellStart"/>
+            <w:r>
+              <w:rPr>
+                <w:rFonts w:ascii="Courier New" w:hAnsi="Courier New" w:cs="Courier New"/>
+              </w:rPr>
+              <w:t>obs_mean</w:t>
+            </w:r>
+            <w:proofErr w:type="spellEnd"/>
+            <w:r>
+              <w:rPr>
+                <w:rFonts w:ascii="Courier New" w:hAnsi="Courier New" w:cs="Courier New"/>
+              </w:rPr>
+              <w:t>)</w:t>
             </w:r>
           </w:p>
           <w:p/>
@@ -1770,6 +1974,7 @@
                 <w:rFonts w:ascii="Courier New" w:hAnsi="Courier New" w:cs="Courier New"/>
               </w:rPr>
             </w:pPr>
+            <w:proofErr w:type="spellStart"/>
             <w:r>
               <w:rPr>
                 <w:rFonts w:ascii="Courier New" w:hAnsi="Courier New" w:cs="Courier New"/>
@@ -1791,6 +1996,7 @@
               </w:rPr>
               <w:t>_dist</w:t>
             </w:r>
+            <w:proofErr w:type="spellEnd"/>
             <w:r>
               <w:rPr>
                 <w:rFonts w:ascii="Courier New" w:hAnsi="Courier New" w:cs="Courier New"/>
@@ -1836,7 +2042,21 @@
               <w:rPr>
                 <w:rFonts w:ascii="Courier New" w:hAnsi="Courier New" w:cs="Courier New"/>
               </w:rPr>
-              <w:t xml:space="preserve">  specify(response = </w:t>
+              <w:t xml:space="preserve">  </w:t>
+            </w:r>
+            <w:proofErr w:type="gramStart"/>
+            <w:r>
+              <w:rPr>
+                <w:rFonts w:ascii="Courier New" w:hAnsi="Courier New" w:cs="Courier New"/>
+              </w:rPr>
+              <w:t>specify(</w:t>
+            </w:r>
+            <w:proofErr w:type="gramEnd"/>
+            <w:r>
+              <w:rPr>
+                <w:rFonts w:ascii="Courier New" w:hAnsi="Courier New" w:cs="Courier New"/>
+              </w:rPr>
+              <w:t xml:space="preserve">response = </w:t>
             </w:r>
             <w:r>
               <w:rPr>
@@ -1923,7 +2143,21 @@
               <w:rPr>
                 <w:rFonts w:ascii="Courier New" w:hAnsi="Courier New" w:cs="Courier New"/>
               </w:rPr>
-              <w:t xml:space="preserve">  generate(reps = </w:t>
+              <w:t xml:space="preserve">  </w:t>
+            </w:r>
+            <w:proofErr w:type="gramStart"/>
+            <w:r>
+              <w:rPr>
+                <w:rFonts w:ascii="Courier New" w:hAnsi="Courier New" w:cs="Courier New"/>
+              </w:rPr>
+              <w:t>generate(</w:t>
+            </w:r>
+            <w:proofErr w:type="gramEnd"/>
+            <w:r>
+              <w:rPr>
+                <w:rFonts w:ascii="Courier New" w:hAnsi="Courier New" w:cs="Courier New"/>
+              </w:rPr>
+              <w:t xml:space="preserve">reps = </w:t>
             </w:r>
             <w:r>
               <w:rPr>
@@ -1960,7 +2194,21 @@
               <w:rPr>
                 <w:rFonts w:ascii="Courier New" w:hAnsi="Courier New" w:cs="Courier New"/>
               </w:rPr>
-              <w:t xml:space="preserve">  calculate(stat = "</w:t>
+              <w:t xml:space="preserve">  </w:t>
+            </w:r>
+            <w:proofErr w:type="gramStart"/>
+            <w:r>
+              <w:rPr>
+                <w:rFonts w:ascii="Courier New" w:hAnsi="Courier New" w:cs="Courier New"/>
+              </w:rPr>
+              <w:t>calculate(</w:t>
+            </w:r>
+            <w:proofErr w:type="gramEnd"/>
+            <w:r>
+              <w:rPr>
+                <w:rFonts w:ascii="Courier New" w:hAnsi="Courier New" w:cs="Courier New"/>
+              </w:rPr>
+              <w:t>stat = "</w:t>
             </w:r>
             <w:r>
               <w:rPr>
@@ -2003,7 +2251,21 @@
               <w:rPr>
                 <w:rFonts w:ascii="Courier New" w:hAnsi="Courier New" w:cs="Courier New"/>
               </w:rPr>
-              <w:t xml:space="preserve">            order = c(“</w:t>
+              <w:t xml:space="preserve">            order = </w:t>
+            </w:r>
+            <w:proofErr w:type="gramStart"/>
+            <w:r>
+              <w:rPr>
+                <w:rFonts w:ascii="Courier New" w:hAnsi="Courier New" w:cs="Courier New"/>
+              </w:rPr>
+              <w:t>c(</w:t>
+            </w:r>
+            <w:proofErr w:type="gramEnd"/>
+            <w:r>
+              <w:rPr>
+                <w:rFonts w:ascii="Courier New" w:hAnsi="Courier New" w:cs="Courier New"/>
+              </w:rPr>
+              <w:t>“</w:t>
             </w:r>
             <w:r>
               <w:rPr>
@@ -2140,12 +2402,37 @@
                 <w:color w:val="000000" w:themeColor="text1"/>
               </w:rPr>
             </w:pPr>
+            <w:proofErr w:type="gramStart"/>
             <w:r>
               <w:rPr>
                 <w:rFonts w:ascii="Courier New" w:hAnsi="Courier New" w:cs="Courier New"/>
                 <w:color w:val="000000" w:themeColor="text1"/>
               </w:rPr>
-              <w:t xml:space="preserve">visualize(data = null_dist, </w:t>
+              <w:t>visualize(</w:t>
+            </w:r>
+            <w:proofErr w:type="gramEnd"/>
+            <w:r>
+              <w:rPr>
+                <w:rFonts w:ascii="Courier New" w:hAnsi="Courier New" w:cs="Courier New"/>
+                <w:color w:val="000000" w:themeColor="text1"/>
+              </w:rPr>
+              <w:t xml:space="preserve">data = </w:t>
+            </w:r>
+            <w:proofErr w:type="spellStart"/>
+            <w:r>
+              <w:rPr>
+                <w:rFonts w:ascii="Courier New" w:hAnsi="Courier New" w:cs="Courier New"/>
+                <w:color w:val="000000" w:themeColor="text1"/>
+              </w:rPr>
+              <w:t>null_dist</w:t>
+            </w:r>
+            <w:proofErr w:type="spellEnd"/>
+            <w:r>
+              <w:rPr>
+                <w:rFonts w:ascii="Courier New" w:hAnsi="Courier New" w:cs="Courier New"/>
+                <w:color w:val="000000" w:themeColor="text1"/>
+              </w:rPr>
+              <w:t xml:space="preserve">, </w:t>
             </w:r>
           </w:p>
           <w:p>
@@ -2286,30 +2573,42 @@
                 <w:rFonts w:ascii="Courier New" w:hAnsi="Courier New" w:cs="Courier New"/>
               </w:rPr>
             </w:pPr>
+            <w:proofErr w:type="spellStart"/>
             <w:r>
               <w:rPr>
                 <w:rFonts w:ascii="Courier New" w:hAnsi="Courier New" w:cs="Courier New"/>
               </w:rPr>
               <w:t>get_</w:t>
             </w:r>
+            <w:proofErr w:type="gramStart"/>
             <w:r>
               <w:rPr>
                 <w:rFonts w:ascii="Courier New" w:hAnsi="Courier New" w:cs="Courier New"/>
               </w:rPr>
               <w:t>pvalue</w:t>
             </w:r>
-            <w:r>
-              <w:rPr>
-                <w:rFonts w:ascii="Courier New" w:hAnsi="Courier New" w:cs="Courier New"/>
-              </w:rPr>
-              <w:t xml:space="preserve">(x = </w:t>
-            </w:r>
+            <w:proofErr w:type="spellEnd"/>
+            <w:r>
+              <w:rPr>
+                <w:rFonts w:ascii="Courier New" w:hAnsi="Courier New" w:cs="Courier New"/>
+              </w:rPr>
+              <w:t>(</w:t>
+            </w:r>
+            <w:proofErr w:type="gramEnd"/>
+            <w:r>
+              <w:rPr>
+                <w:rFonts w:ascii="Courier New" w:hAnsi="Courier New" w:cs="Courier New"/>
+              </w:rPr>
+              <w:t xml:space="preserve">x = </w:t>
+            </w:r>
+            <w:proofErr w:type="spellStart"/>
             <w:r>
               <w:rPr>
                 <w:rFonts w:ascii="Courier New" w:hAnsi="Courier New" w:cs="Courier New"/>
               </w:rPr>
               <w:t>null_dist</w:t>
             </w:r>
+            <w:proofErr w:type="spellEnd"/>
             <w:r>
               <w:rPr>
                 <w:rFonts w:ascii="Courier New" w:hAnsi="Courier New" w:cs="Courier New"/>
@@ -2328,14 +2627,37 @@
               <w:rPr>
                 <w:rFonts w:ascii="Courier New" w:hAnsi="Courier New" w:cs="Courier New"/>
               </w:rPr>
-              <w:t xml:space="preserve">           obs_stat = </w:t>
-            </w:r>
+              <w:t xml:space="preserve">           </w:t>
+            </w:r>
+            <w:proofErr w:type="spellStart"/>
+            <w:r>
+              <w:rPr>
+                <w:rFonts w:ascii="Courier New" w:hAnsi="Courier New" w:cs="Courier New"/>
+              </w:rPr>
+              <w:t>obs_stat</w:t>
+            </w:r>
+            <w:proofErr w:type="spellEnd"/>
+            <w:r>
+              <w:rPr>
+                <w:rFonts w:ascii="Courier New" w:hAnsi="Courier New" w:cs="Courier New"/>
+              </w:rPr>
+              <w:t xml:space="preserve"> = </w:t>
+            </w:r>
+            <w:proofErr w:type="spellStart"/>
             <w:r>
               <w:rPr>
                 <w:rFonts w:ascii="Courier New" w:hAnsi="Courier New" w:cs="Courier New"/>
                 <w:color w:val="000000" w:themeColor="text1"/>
               </w:rPr>
-              <w:t>obs_diff_in_means,</w:t>
+              <w:t>obs_diff_in_means</w:t>
+            </w:r>
+            <w:proofErr w:type="spellEnd"/>
+            <w:r>
+              <w:rPr>
+                <w:rFonts w:ascii="Courier New" w:hAnsi="Courier New" w:cs="Courier New"/>
+                <w:color w:val="000000" w:themeColor="text1"/>
+              </w:rPr>
+              <w:t>,</w:t>
             </w:r>
           </w:p>
           <w:p>
@@ -2535,11 +2857,27 @@
                 <w:rFonts w:ascii="Courier New" w:hAnsi="Courier New" w:cs="Courier New"/>
               </w:rPr>
             </w:pPr>
-            <w:r>
-              <w:rPr>
-                <w:rFonts w:ascii="Courier New" w:hAnsi="Courier New" w:cs="Courier New"/>
-              </w:rPr>
-              <w:t xml:space="preserve">ggplot(data = </w:t>
+            <w:proofErr w:type="spellStart"/>
+            <w:proofErr w:type="gramStart"/>
+            <w:r>
+              <w:rPr>
+                <w:rFonts w:ascii="Courier New" w:hAnsi="Courier New" w:cs="Courier New"/>
+              </w:rPr>
+              <w:t>ggplot</w:t>
+            </w:r>
+            <w:proofErr w:type="spellEnd"/>
+            <w:r>
+              <w:rPr>
+                <w:rFonts w:ascii="Courier New" w:hAnsi="Courier New" w:cs="Courier New"/>
+              </w:rPr>
+              <w:t>(</w:t>
+            </w:r>
+            <w:proofErr w:type="gramEnd"/>
+            <w:r>
+              <w:rPr>
+                <w:rFonts w:ascii="Courier New" w:hAnsi="Courier New" w:cs="Courier New"/>
+              </w:rPr>
+              <w:t xml:space="preserve">data = </w:t>
             </w:r>
             <w:r>
               <w:rPr>
@@ -2565,7 +2903,29 @@
               <w:rPr>
                 <w:rFonts w:ascii="Courier New" w:hAnsi="Courier New" w:cs="Courier New"/>
               </w:rPr>
-              <w:t xml:space="preserve">       mapping = aes(x = </w:t>
+              <w:t xml:space="preserve">       mapping = </w:t>
+            </w:r>
+            <w:proofErr w:type="spellStart"/>
+            <w:proofErr w:type="gramStart"/>
+            <w:r>
+              <w:rPr>
+                <w:rFonts w:ascii="Courier New" w:hAnsi="Courier New" w:cs="Courier New"/>
+              </w:rPr>
+              <w:t>aes</w:t>
+            </w:r>
+            <w:proofErr w:type="spellEnd"/>
+            <w:r>
+              <w:rPr>
+                <w:rFonts w:ascii="Courier New" w:hAnsi="Courier New" w:cs="Courier New"/>
+              </w:rPr>
+              <w:t>(</w:t>
+            </w:r>
+            <w:proofErr w:type="gramEnd"/>
+            <w:r>
+              <w:rPr>
+                <w:rFonts w:ascii="Courier New" w:hAnsi="Courier New" w:cs="Courier New"/>
+              </w:rPr>
+              <w:t xml:space="preserve">x = </w:t>
             </w:r>
             <w:r>
               <w:rPr>
@@ -2605,7 +2965,43 @@
               <w:rPr>
                 <w:rFonts w:ascii="Courier New" w:hAnsi="Courier New" w:cs="Courier New"/>
               </w:rPr>
-              <w:t xml:space="preserve">  geom_histogram(binwidth = </w:t>
+              <w:t xml:space="preserve">  </w:t>
+            </w:r>
+            <w:proofErr w:type="spellStart"/>
+            <w:r>
+              <w:rPr>
+                <w:rFonts w:ascii="Courier New" w:hAnsi="Courier New" w:cs="Courier New"/>
+              </w:rPr>
+              <w:t>geom_</w:t>
+            </w:r>
+            <w:proofErr w:type="gramStart"/>
+            <w:r>
+              <w:rPr>
+                <w:rFonts w:ascii="Courier New" w:hAnsi="Courier New" w:cs="Courier New"/>
+              </w:rPr>
+              <w:t>histogram</w:t>
+            </w:r>
+            <w:proofErr w:type="spellEnd"/>
+            <w:r>
+              <w:rPr>
+                <w:rFonts w:ascii="Courier New" w:hAnsi="Courier New" w:cs="Courier New"/>
+              </w:rPr>
+              <w:t>(</w:t>
+            </w:r>
+            <w:proofErr w:type="spellStart"/>
+            <w:proofErr w:type="gramEnd"/>
+            <w:r>
+              <w:rPr>
+                <w:rFonts w:ascii="Courier New" w:hAnsi="Courier New" w:cs="Courier New"/>
+              </w:rPr>
+              <w:t>binwidth</w:t>
+            </w:r>
+            <w:proofErr w:type="spellEnd"/>
+            <w:r>
+              <w:rPr>
+                <w:rFonts w:ascii="Courier New" w:hAnsi="Courier New" w:cs="Courier New"/>
+              </w:rPr>
+              <w:t xml:space="preserve"> = </w:t>
             </w:r>
             <w:r>
               <w:rPr>
@@ -2631,7 +3027,35 @@
               <w:rPr>
                 <w:rFonts w:ascii="Courier New" w:hAnsi="Courier New" w:cs="Courier New"/>
               </w:rPr>
-              <w:t xml:space="preserve">  facet_wrap(~</w:t>
+              <w:t xml:space="preserve">  </w:t>
+            </w:r>
+            <w:proofErr w:type="spellStart"/>
+            <w:r>
+              <w:rPr>
+                <w:rFonts w:ascii="Courier New" w:hAnsi="Courier New" w:cs="Courier New"/>
+              </w:rPr>
+              <w:t>facet_</w:t>
+            </w:r>
+            <w:proofErr w:type="gramStart"/>
+            <w:r>
+              <w:rPr>
+                <w:rFonts w:ascii="Courier New" w:hAnsi="Courier New" w:cs="Courier New"/>
+              </w:rPr>
+              <w:t>wrap</w:t>
+            </w:r>
+            <w:proofErr w:type="spellEnd"/>
+            <w:r>
+              <w:rPr>
+                <w:rFonts w:ascii="Courier New" w:hAnsi="Courier New" w:cs="Courier New"/>
+              </w:rPr>
+              <w:t>(</w:t>
+            </w:r>
+            <w:proofErr w:type="gramEnd"/>
+            <w:r>
+              <w:rPr>
+                <w:rFonts w:ascii="Courier New" w:hAnsi="Courier New" w:cs="Courier New"/>
+              </w:rPr>
+              <w:t>~</w:t>
             </w:r>
             <w:r>
               <w:rPr>
@@ -2671,7 +3095,21 @@
               <w:rPr>
                 <w:rFonts w:ascii="Courier New" w:hAnsi="Courier New" w:cs="Courier New"/>
               </w:rPr>
-              <w:t xml:space="preserve">  labs(x = "</w:t>
+              <w:t xml:space="preserve">  </w:t>
+            </w:r>
+            <w:proofErr w:type="gramStart"/>
+            <w:r>
+              <w:rPr>
+                <w:rFonts w:ascii="Courier New" w:hAnsi="Courier New" w:cs="Courier New"/>
+              </w:rPr>
+              <w:t>labs(</w:t>
+            </w:r>
+            <w:proofErr w:type="gramEnd"/>
+            <w:r>
+              <w:rPr>
+                <w:rFonts w:ascii="Courier New" w:hAnsi="Courier New" w:cs="Courier New"/>
+              </w:rPr>
+              <w:t>x = "</w:t>
             </w:r>
             <w:r>
               <w:rPr>
@@ -2788,11 +3226,27 @@
                 <w:rFonts w:ascii="Courier New" w:hAnsi="Courier New" w:cs="Courier New"/>
               </w:rPr>
             </w:pPr>
-            <w:r>
-              <w:rPr>
-                <w:rFonts w:ascii="Courier New" w:hAnsi="Courier New" w:cs="Courier New"/>
-              </w:rPr>
-              <w:t xml:space="preserve">ggplot(data = </w:t>
+            <w:proofErr w:type="spellStart"/>
+            <w:proofErr w:type="gramStart"/>
+            <w:r>
+              <w:rPr>
+                <w:rFonts w:ascii="Courier New" w:hAnsi="Courier New" w:cs="Courier New"/>
+              </w:rPr>
+              <w:t>ggplot</w:t>
+            </w:r>
+            <w:proofErr w:type="spellEnd"/>
+            <w:r>
+              <w:rPr>
+                <w:rFonts w:ascii="Courier New" w:hAnsi="Courier New" w:cs="Courier New"/>
+              </w:rPr>
+              <w:t>(</w:t>
+            </w:r>
+            <w:proofErr w:type="gramEnd"/>
+            <w:r>
+              <w:rPr>
+                <w:rFonts w:ascii="Courier New" w:hAnsi="Courier New" w:cs="Courier New"/>
+              </w:rPr>
+              <w:t xml:space="preserve">data = </w:t>
             </w:r>
             <w:r>
               <w:rPr>
@@ -2818,7 +3272,29 @@
               <w:rPr>
                 <w:rFonts w:ascii="Courier New" w:hAnsi="Courier New" w:cs="Courier New"/>
               </w:rPr>
-              <w:t xml:space="preserve">       mapping = aes(x = </w:t>
+              <w:t xml:space="preserve">       mapping = </w:t>
+            </w:r>
+            <w:proofErr w:type="spellStart"/>
+            <w:proofErr w:type="gramStart"/>
+            <w:r>
+              <w:rPr>
+                <w:rFonts w:ascii="Courier New" w:hAnsi="Courier New" w:cs="Courier New"/>
+              </w:rPr>
+              <w:t>aes</w:t>
+            </w:r>
+            <w:proofErr w:type="spellEnd"/>
+            <w:r>
+              <w:rPr>
+                <w:rFonts w:ascii="Courier New" w:hAnsi="Courier New" w:cs="Courier New"/>
+              </w:rPr>
+              <w:t>(</w:t>
+            </w:r>
+            <w:proofErr w:type="gramEnd"/>
+            <w:r>
+              <w:rPr>
+                <w:rFonts w:ascii="Courier New" w:hAnsi="Courier New" w:cs="Courier New"/>
+              </w:rPr>
+              <w:t xml:space="preserve">x = </w:t>
             </w:r>
             <w:r>
               <w:rPr>
@@ -2884,32 +3360,62 @@
               <w:rPr>
                 <w:rFonts w:ascii="Courier New" w:hAnsi="Courier New" w:cs="Courier New"/>
               </w:rPr>
-              <w:t xml:space="preserve">  geom_</w:t>
-            </w:r>
+              <w:t xml:space="preserve">  </w:t>
+            </w:r>
+            <w:proofErr w:type="spellStart"/>
+            <w:r>
+              <w:rPr>
+                <w:rFonts w:ascii="Courier New" w:hAnsi="Courier New" w:cs="Courier New"/>
+              </w:rPr>
+              <w:t>geom_</w:t>
+            </w:r>
+            <w:proofErr w:type="gramStart"/>
             <w:r>
               <w:rPr>
                 <w:rFonts w:ascii="Courier New" w:hAnsi="Courier New" w:cs="Courier New"/>
               </w:rPr>
               <w:t>boxplot</w:t>
             </w:r>
-            <w:r>
-              <w:rPr>
-                <w:rFonts w:ascii="Courier New" w:hAnsi="Courier New" w:cs="Courier New"/>
-              </w:rPr>
-              <w:t xml:space="preserve">() + </w:t>
-            </w:r>
-          </w:p>
-          <w:p>
-            <w:pPr>
-              <w:rPr>
-                <w:rFonts w:ascii="Courier New" w:hAnsi="Courier New" w:cs="Courier New"/>
-              </w:rPr>
-            </w:pPr>
-            <w:r>
-              <w:rPr>
-                <w:rFonts w:ascii="Courier New" w:hAnsi="Courier New" w:cs="Courier New"/>
-              </w:rPr>
-              <w:t xml:space="preserve">  labs(x = </w:t>
+            <w:proofErr w:type="spellEnd"/>
+            <w:r>
+              <w:rPr>
+                <w:rFonts w:ascii="Courier New" w:hAnsi="Courier New" w:cs="Courier New"/>
+              </w:rPr>
+              <w:t>(</w:t>
+            </w:r>
+            <w:proofErr w:type="gramEnd"/>
+            <w:r>
+              <w:rPr>
+                <w:rFonts w:ascii="Courier New" w:hAnsi="Courier New" w:cs="Courier New"/>
+              </w:rPr>
+              <w:t xml:space="preserve">) + </w:t>
+            </w:r>
+          </w:p>
+          <w:p>
+            <w:pPr>
+              <w:rPr>
+                <w:rFonts w:ascii="Courier New" w:hAnsi="Courier New" w:cs="Courier New"/>
+              </w:rPr>
+            </w:pPr>
+            <w:r>
+              <w:rPr>
+                <w:rFonts w:ascii="Courier New" w:hAnsi="Courier New" w:cs="Courier New"/>
+              </w:rPr>
+              <w:t xml:space="preserve">  </w:t>
+            </w:r>
+            <w:proofErr w:type="gramStart"/>
+            <w:r>
+              <w:rPr>
+                <w:rFonts w:ascii="Courier New" w:hAnsi="Courier New" w:cs="Courier New"/>
+              </w:rPr>
+              <w:t>labs(</w:t>
+            </w:r>
+            <w:proofErr w:type="gramEnd"/>
+            <w:r>
+              <w:rPr>
+                <w:rFonts w:ascii="Courier New" w:hAnsi="Courier New" w:cs="Courier New"/>
+              </w:rPr>
+              <w:t xml:space="preserve">x = </w:t>
             </w:r>
             <w:r>
               <w:rPr>
@@ -3027,7 +3533,15 @@
               <w:t>horizontally stacked</w:t>
             </w:r>
             <w:r>
-              <w:t xml:space="preserve"> boxplots, the categorical variable should be on the </w:t>
+              <w:t xml:space="preserve"> </w:t>
+            </w:r>
+            <w:proofErr w:type="gramStart"/>
+            <w:r>
+              <w:t>boxplots</w:t>
+            </w:r>
+            <w:proofErr w:type="gramEnd"/>
+            <w:r>
+              <w:t xml:space="preserve">, the categorical variable should be on the </w:t>
             </w:r>
             <w:r>
               <w:rPr>
@@ -3056,7 +3570,15 @@
               <w:t>vertically stacked</w:t>
             </w:r>
             <w:r>
-              <w:t xml:space="preserve"> boxplots, the categorical variable should be on the </w:t>
+              <w:t xml:space="preserve"> </w:t>
+            </w:r>
+            <w:proofErr w:type="gramStart"/>
+            <w:r>
+              <w:t>boxplots</w:t>
+            </w:r>
+            <w:proofErr w:type="gramEnd"/>
+            <w:r>
+              <w:t xml:space="preserve">, the categorical variable should be on the </w:t>
             </w:r>
             <w:r>
               <w:rPr>
@@ -3141,12 +3663,22 @@
                 <w:rFonts w:ascii="Courier New" w:hAnsi="Courier New" w:cs="Courier New"/>
               </w:rPr>
             </w:pPr>
-            <w:r>
-              <w:rPr>
-                <w:rFonts w:ascii="Courier New" w:hAnsi="Courier New" w:cs="Courier New"/>
-              </w:rPr>
-              <w:t>favstats(</w:t>
-            </w:r>
+            <w:proofErr w:type="spellStart"/>
+            <w:proofErr w:type="gramStart"/>
+            <w:r>
+              <w:rPr>
+                <w:rFonts w:ascii="Courier New" w:hAnsi="Courier New" w:cs="Courier New"/>
+              </w:rPr>
+              <w:t>favstats</w:t>
+            </w:r>
+            <w:proofErr w:type="spellEnd"/>
+            <w:r>
+              <w:rPr>
+                <w:rFonts w:ascii="Courier New" w:hAnsi="Courier New" w:cs="Courier New"/>
+              </w:rPr>
+              <w:t>(</w:t>
+            </w:r>
+            <w:proofErr w:type="gramEnd"/>
             <w:r>
               <w:rPr>
                 <w:rFonts w:ascii="Courier New" w:hAnsi="Courier New" w:cs="Courier New"/>
@@ -3344,12 +3876,22 @@
                 <w:color w:val="FF0000"/>
               </w:rPr>
             </w:pPr>
-            <w:r>
-              <w:rPr>
-                <w:rFonts w:ascii="Courier New" w:hAnsi="Courier New" w:cs="Courier New"/>
-              </w:rPr>
-              <w:t>aov(</w:t>
-            </w:r>
+            <w:proofErr w:type="spellStart"/>
+            <w:proofErr w:type="gramStart"/>
+            <w:r>
+              <w:rPr>
+                <w:rFonts w:ascii="Courier New" w:hAnsi="Courier New" w:cs="Courier New"/>
+              </w:rPr>
+              <w:t>aov</w:t>
+            </w:r>
+            <w:proofErr w:type="spellEnd"/>
+            <w:r>
+              <w:rPr>
+                <w:rFonts w:ascii="Courier New" w:hAnsi="Courier New" w:cs="Courier New"/>
+              </w:rPr>
+              <w:t>(</w:t>
+            </w:r>
+            <w:proofErr w:type="gramEnd"/>
             <w:r>
               <w:rPr>
                 <w:rFonts w:ascii="Courier New" w:hAnsi="Courier New" w:cs="Courier New"/>
@@ -3456,575 +3998,8 @@
         </w:tc>
       </w:tr>
     </w:tbl>
-    <w:p>
-      <w:r>
-        <w:br w:type="page"/>
-      </w:r>
-    </w:p>
-    <w:tbl>
-      <w:tblPr>
-        <w:tblStyle w:val="TableGrid"/>
-        <w:tblW w:w="10800" w:type="dxa"/>
-        <w:tblInd w:w="-815" w:type="dxa"/>
-        <w:tblLook w:val="04A0" w:firstRow="1" w:lastRow="0" w:firstColumn="1" w:lastColumn="0" w:noHBand="0" w:noVBand="1"/>
-      </w:tblPr>
-      <w:tblGrid>
-        <w:gridCol w:w="10800"/>
-      </w:tblGrid>
-      <w:tr>
-        <w:tc>
-          <w:tcPr>
-            <w:tcW w:w="10800" w:type="dxa"/>
-          </w:tcPr>
-          <w:p>
-            <w:pPr>
-              <w:jc w:val="center"/>
-              <w:rPr>
-                <w:b/>
-                <w:bCs/>
-                <w:sz w:val="28"/>
-                <w:szCs w:val="28"/>
-              </w:rPr>
-            </w:pPr>
-            <w:r>
-              <w:rPr>
-                <w:b/>
-                <w:bCs/>
-                <w:sz w:val="28"/>
-                <w:szCs w:val="28"/>
-              </w:rPr>
-              <w:lastRenderedPageBreak/>
-              <w:t>Plotting the Bootstrap Distribution</w:t>
-            </w:r>
-          </w:p>
-          <w:p>
-            <w:pPr>
-              <w:jc w:val="center"/>
-              <w:rPr>
-                <w:b/>
-                <w:bCs/>
-                <w:sz w:val="28"/>
-                <w:szCs w:val="28"/>
-              </w:rPr>
-            </w:pPr>
-          </w:p>
-          <w:p>
-            <w:pPr>
-              <w:rPr>
-                <w:rFonts w:ascii="Courier New" w:hAnsi="Courier New" w:cs="Courier New"/>
-                <w:color w:val="000000" w:themeColor="text1"/>
-              </w:rPr>
-            </w:pPr>
-            <w:r>
-              <w:rPr>
-                <w:rFonts w:ascii="Courier New" w:hAnsi="Courier New" w:cs="Courier New"/>
-                <w:color w:val="000000" w:themeColor="text1"/>
-              </w:rPr>
-              <w:t xml:space="preserve">visualize(data = bootstrap, </w:t>
-            </w:r>
-          </w:p>
-          <w:p>
-            <w:pPr>
-              <w:rPr>
-                <w:rFonts w:ascii="Courier New" w:hAnsi="Courier New" w:cs="Courier New"/>
-                <w:color w:val="000000" w:themeColor="text1"/>
-              </w:rPr>
-            </w:pPr>
-            <w:r>
-              <w:rPr>
-                <w:rFonts w:ascii="Courier New" w:hAnsi="Courier New" w:cs="Courier New"/>
-                <w:color w:val="000000" w:themeColor="text1"/>
-              </w:rPr>
-              <w:t xml:space="preserve">          method = “simulation”)</w:t>
-            </w:r>
-          </w:p>
-          <w:p>
-            <w:pPr>
-              <w:rPr>
-                <w:rFonts w:ascii="Courier New" w:hAnsi="Courier New" w:cs="Courier New"/>
-                <w:color w:val="000000" w:themeColor="text1"/>
-              </w:rPr>
-            </w:pPr>
-          </w:p>
-          <w:p>
-            <w:pPr>
-              <w:rPr>
-                <w:i/>
-                <w:iCs/>
-              </w:rPr>
-            </w:pPr>
-            <w:r>
-              <w:rPr>
-                <w:b/>
-                <w:bCs/>
-                <w:i/>
-                <w:iCs/>
-              </w:rPr>
-              <w:t>Note:</w:t>
-            </w:r>
-            <w:r>
-              <w:rPr>
-                <w:b/>
-                <w:bCs/>
-                <w:i/>
-                <w:iCs/>
-              </w:rPr>
-              <w:t xml:space="preserve"> </w:t>
-            </w:r>
-            <w:r>
-              <w:rPr>
-                <w:i/>
-                <w:iCs/>
-              </w:rPr>
-              <w:t xml:space="preserve">This is </w:t>
-            </w:r>
-            <w:r>
-              <w:rPr>
-                <w:b/>
-                <w:bCs/>
-                <w:i/>
-                <w:iCs/>
-              </w:rPr>
-              <w:t>the same</w:t>
-            </w:r>
-            <w:r>
-              <w:rPr>
-                <w:i/>
-                <w:iCs/>
-              </w:rPr>
-              <w:t xml:space="preserve"> as plotting the bootstrap for one mean! </w:t>
-            </w:r>
-          </w:p>
-          <w:p>
-            <w:pPr>
-              <w:rPr>
-                <w:rFonts w:asciiTheme="majorHAnsi" w:hAnsiTheme="majorHAnsi" w:cstheme="majorHAnsi"/>
-              </w:rPr>
-            </w:pPr>
-          </w:p>
-        </w:tc>
-      </w:tr>
-      <w:tr>
-        <w:tc>
-          <w:tcPr>
-            <w:tcW w:w="10800" w:type="dxa"/>
-          </w:tcPr>
-          <w:p>
-            <w:pPr>
-              <w:jc w:val="center"/>
-              <w:rPr>
-                <w:b/>
-                <w:bCs/>
-                <w:sz w:val="28"/>
-                <w:szCs w:val="28"/>
-              </w:rPr>
-            </w:pPr>
-            <w:r>
-              <w:rPr>
-                <w:b/>
-                <w:bCs/>
-                <w:sz w:val="28"/>
-                <w:szCs w:val="28"/>
-              </w:rPr>
-              <w:t>Obtaining the Sample Slope</w:t>
-            </w:r>
-          </w:p>
-          <w:p>
-            <w:pPr>
-              <w:jc w:val="center"/>
-              <w:rPr>
-                <w:b/>
-                <w:bCs/>
-                <w:sz w:val="28"/>
-                <w:szCs w:val="28"/>
-              </w:rPr>
-            </w:pPr>
-          </w:p>
-          <w:p>
-            <w:pPr>
-              <w:rPr>
-                <w:rFonts w:ascii="Courier New" w:hAnsi="Courier New" w:cs="Courier New"/>
-              </w:rPr>
-            </w:pPr>
-            <w:r>
-              <w:rPr>
-                <w:rFonts w:ascii="Courier New" w:hAnsi="Courier New" w:cs="Courier New"/>
-                <w:color w:val="000000" w:themeColor="text1"/>
-              </w:rPr>
-              <w:t xml:space="preserve">obs_mean &lt;- </w:t>
-            </w:r>
-            <w:r>
-              <w:rPr>
-                <w:rFonts w:ascii="Courier New" w:hAnsi="Courier New" w:cs="Courier New"/>
-                <w:color w:val="FF0000"/>
-              </w:rPr>
-              <w:t>NAME OF DATASET</w:t>
-            </w:r>
-            <w:r>
-              <w:rPr>
-                <w:rFonts w:ascii="Courier New" w:hAnsi="Courier New" w:cs="Courier New"/>
-              </w:rPr>
-              <w:t xml:space="preserve"> </w:t>
-            </w:r>
-            <w:r>
-              <w:rPr>
-                <w:rFonts w:ascii="Courier New" w:hAnsi="Courier New" w:cs="Courier New"/>
-              </w:rPr>
-              <w:t>%&gt;%</w:t>
-            </w:r>
-          </w:p>
-          <w:p>
-            <w:pPr>
-              <w:rPr>
-                <w:rFonts w:ascii="Courier New" w:hAnsi="Courier New" w:cs="Courier New"/>
-                <w:color w:val="FF0000"/>
-              </w:rPr>
-            </w:pPr>
-            <w:r>
-              <w:rPr>
-                <w:rFonts w:ascii="Courier New" w:hAnsi="Courier New" w:cs="Courier New"/>
-              </w:rPr>
-              <w:t xml:space="preserve">  specify(response = </w:t>
-            </w:r>
-            <w:r>
-              <w:rPr>
-                <w:rFonts w:ascii="Courier New" w:hAnsi="Courier New" w:cs="Courier New"/>
-                <w:color w:val="FF0000"/>
-              </w:rPr>
-              <w:t xml:space="preserve">NAME OF </w:t>
-            </w:r>
-            <w:r>
-              <w:rPr>
-                <w:rFonts w:ascii="Courier New" w:hAnsi="Courier New" w:cs="Courier New"/>
-                <w:color w:val="FF0000"/>
-              </w:rPr>
-              <w:t>Y-</w:t>
-            </w:r>
-            <w:r>
-              <w:rPr>
-                <w:rFonts w:ascii="Courier New" w:hAnsi="Courier New" w:cs="Courier New"/>
-                <w:color w:val="FF0000"/>
-              </w:rPr>
-              <w:t>VARIABLE</w:t>
-            </w:r>
-            <w:r>
-              <w:rPr>
-                <w:rFonts w:ascii="Courier New" w:hAnsi="Courier New" w:cs="Courier New"/>
-                <w:color w:val="000000" w:themeColor="text1"/>
-              </w:rPr>
-              <w:t>,</w:t>
-            </w:r>
-            <w:r>
-              <w:rPr>
-                <w:rFonts w:ascii="Courier New" w:hAnsi="Courier New" w:cs="Courier New"/>
-                <w:color w:val="FF0000"/>
-              </w:rPr>
-              <w:t xml:space="preserve"> </w:t>
-            </w:r>
-          </w:p>
-          <w:p>
-            <w:pPr>
-              <w:rPr>
-                <w:rFonts w:ascii="Courier New" w:hAnsi="Courier New" w:cs="Courier New"/>
-              </w:rPr>
-            </w:pPr>
-            <w:r>
-              <w:rPr>
-                <w:rFonts w:ascii="Courier New" w:hAnsi="Courier New" w:cs="Courier New"/>
-                <w:color w:val="FF0000"/>
-              </w:rPr>
-              <w:t xml:space="preserve">          </w:t>
-            </w:r>
-            <w:r>
-              <w:rPr>
-                <w:rFonts w:ascii="Courier New" w:hAnsi="Courier New" w:cs="Courier New"/>
-                <w:color w:val="000000" w:themeColor="text1"/>
-              </w:rPr>
-              <w:t>explanatory =</w:t>
-            </w:r>
-            <w:r>
-              <w:rPr>
-                <w:rFonts w:ascii="Courier New" w:hAnsi="Courier New" w:cs="Courier New"/>
-                <w:color w:val="FF0000"/>
-              </w:rPr>
-              <w:t xml:space="preserve"> NAME OF X-VARIABLE</w:t>
-            </w:r>
-            <w:r>
-              <w:rPr>
-                <w:rFonts w:ascii="Courier New" w:hAnsi="Courier New" w:cs="Courier New"/>
-              </w:rPr>
-              <w:t xml:space="preserve">) %&gt;% </w:t>
-            </w:r>
-          </w:p>
-          <w:p>
-            <w:pPr>
-              <w:rPr>
-                <w:rFonts w:ascii="Courier New" w:hAnsi="Courier New" w:cs="Courier New"/>
-              </w:rPr>
-            </w:pPr>
-            <w:r>
-              <w:rPr>
-                <w:rFonts w:ascii="Courier New" w:hAnsi="Courier New" w:cs="Courier New"/>
-              </w:rPr>
-              <w:t xml:space="preserve">  </w:t>
-            </w:r>
-            <w:r>
-              <w:rPr>
-                <w:rFonts w:ascii="Courier New" w:hAnsi="Courier New" w:cs="Courier New"/>
-              </w:rPr>
-              <w:t>calculate(stat = "mean")</w:t>
-            </w:r>
-          </w:p>
-          <w:p>
-            <w:pPr>
-              <w:rPr>
-                <w:rFonts w:ascii="Courier New" w:hAnsi="Courier New" w:cs="Courier New"/>
-              </w:rPr>
-            </w:pPr>
-          </w:p>
-          <w:p>
-            <w:pPr>
-              <w:rPr>
-                <w:i/>
-                <w:iCs/>
-              </w:rPr>
-            </w:pPr>
-            <w:r>
-              <w:rPr>
-                <w:b/>
-                <w:bCs/>
-                <w:i/>
-                <w:iCs/>
-              </w:rPr>
-              <w:t>Note:</w:t>
-            </w:r>
-            <w:r>
-              <w:rPr>
-                <w:b/>
-                <w:bCs/>
-                <w:i/>
-                <w:iCs/>
-              </w:rPr>
-              <w:t xml:space="preserve"> </w:t>
-            </w:r>
-            <w:r>
-              <w:rPr>
-                <w:i/>
-                <w:iCs/>
-              </w:rPr>
-              <w:t xml:space="preserve">This step </w:t>
-            </w:r>
-            <w:r>
-              <w:rPr>
-                <w:b/>
-                <w:bCs/>
-                <w:i/>
-                <w:iCs/>
-              </w:rPr>
-              <w:t xml:space="preserve">must </w:t>
-            </w:r>
-            <w:r>
-              <w:rPr>
-                <w:i/>
-                <w:iCs/>
-              </w:rPr>
-              <w:t>be done</w:t>
-            </w:r>
-            <w:r>
-              <w:rPr>
-                <w:b/>
-                <w:bCs/>
-                <w:i/>
-                <w:iCs/>
-              </w:rPr>
-              <w:t xml:space="preserve"> before</w:t>
-            </w:r>
-            <w:r>
-              <w:rPr>
-                <w:i/>
-                <w:iCs/>
-              </w:rPr>
-              <w:t xml:space="preserve"> you find your confidence interval!</w:t>
-            </w:r>
-          </w:p>
-          <w:p>
-            <w:pPr>
-              <w:jc w:val="center"/>
-              <w:rPr>
-                <w:b/>
-                <w:bCs/>
-                <w:sz w:val="28"/>
-                <w:szCs w:val="28"/>
-              </w:rPr>
-            </w:pPr>
-          </w:p>
-        </w:tc>
-      </w:tr>
-      <w:tr>
-        <w:tc>
-          <w:tcPr>
-            <w:tcW w:w="10800" w:type="dxa"/>
-          </w:tcPr>
-          <w:p>
-            <w:pPr>
-              <w:jc w:val="center"/>
-              <w:rPr>
-                <w:b/>
-                <w:bCs/>
-                <w:sz w:val="28"/>
-                <w:szCs w:val="28"/>
-              </w:rPr>
-            </w:pPr>
-            <w:r>
-              <w:rPr>
-                <w:b/>
-                <w:bCs/>
-                <w:sz w:val="28"/>
-                <w:szCs w:val="28"/>
-              </w:rPr>
-              <w:t>Obtaining a Confidence Interval from a Bootstrap Distribution</w:t>
-            </w:r>
-          </w:p>
-          <w:p>
-            <w:pPr>
-              <w:jc w:val="center"/>
-              <w:rPr>
-                <w:b/>
-                <w:bCs/>
-                <w:sz w:val="28"/>
-                <w:szCs w:val="28"/>
-              </w:rPr>
-            </w:pPr>
-          </w:p>
-          <w:p>
-            <w:pPr>
-              <w:rPr>
-                <w:rFonts w:ascii="Courier New" w:hAnsi="Courier New" w:cs="Courier New"/>
-              </w:rPr>
-            </w:pPr>
-            <w:r>
-              <w:rPr>
-                <w:rFonts w:ascii="Courier New" w:hAnsi="Courier New" w:cs="Courier New"/>
-              </w:rPr>
-              <w:t xml:space="preserve">get_confidence_interval(x = bootstrap, </w:t>
-            </w:r>
-          </w:p>
-          <w:p>
-            <w:pPr>
-              <w:rPr>
-                <w:rFonts w:ascii="Courier New" w:hAnsi="Courier New" w:cs="Courier New"/>
-              </w:rPr>
-            </w:pPr>
-            <w:r>
-              <w:rPr>
-                <w:rFonts w:ascii="Courier New" w:hAnsi="Courier New" w:cs="Courier New"/>
-              </w:rPr>
-              <w:t xml:space="preserve">                        </w:t>
-            </w:r>
-            <w:r>
-              <w:rPr>
-                <w:rFonts w:ascii="Courier New" w:hAnsi="Courier New" w:cs="Courier New"/>
-                <w:color w:val="0070C0"/>
-              </w:rPr>
-              <w:t>level = 0.95</w:t>
-            </w:r>
-            <w:r>
-              <w:rPr>
-                <w:rFonts w:ascii="Courier New" w:hAnsi="Courier New" w:cs="Courier New"/>
-              </w:rPr>
-              <w:t xml:space="preserve">, </w:t>
-            </w:r>
-          </w:p>
-          <w:p>
-            <w:pPr>
-              <w:rPr>
-                <w:rFonts w:ascii="Courier New" w:hAnsi="Courier New" w:cs="Courier New"/>
-              </w:rPr>
-            </w:pPr>
-            <w:r>
-              <w:rPr>
-                <w:rFonts w:ascii="Courier New" w:hAnsi="Courier New" w:cs="Courier New"/>
-              </w:rPr>
-              <w:t xml:space="preserve">                        type = “percentile”, </w:t>
-            </w:r>
-          </w:p>
-          <w:p>
-            <w:pPr>
-              <w:rPr>
-                <w:rFonts w:ascii="Courier New" w:hAnsi="Courier New" w:cs="Courier New"/>
-              </w:rPr>
-            </w:pPr>
-            <w:r>
-              <w:rPr>
-                <w:rFonts w:ascii="Courier New" w:hAnsi="Courier New" w:cs="Courier New"/>
-              </w:rPr>
-              <w:t xml:space="preserve">                        point_estimate = obs_mean)</w:t>
-            </w:r>
-          </w:p>
-          <w:p/>
-          <w:p>
-            <w:pPr>
-              <w:rPr>
-                <w:i/>
-                <w:iCs/>
-              </w:rPr>
-            </w:pPr>
-            <w:r>
-              <w:rPr>
-                <w:b/>
-                <w:bCs/>
-                <w:i/>
-                <w:iCs/>
-              </w:rPr>
-              <w:t>Note:</w:t>
-            </w:r>
-            <w:r>
-              <w:rPr>
-                <w:b/>
-                <w:bCs/>
-                <w:i/>
-                <w:iCs/>
-              </w:rPr>
-              <w:t xml:space="preserve"> </w:t>
-            </w:r>
-            <w:r>
-              <w:rPr>
-                <w:i/>
-                <w:iCs/>
-              </w:rPr>
-              <w:t xml:space="preserve">This is </w:t>
-            </w:r>
-            <w:r>
-              <w:rPr>
-                <w:b/>
-                <w:bCs/>
-                <w:i/>
-                <w:iCs/>
-              </w:rPr>
-              <w:t>the same</w:t>
-            </w:r>
-            <w:r>
-              <w:rPr>
-                <w:i/>
-                <w:iCs/>
-              </w:rPr>
-              <w:t xml:space="preserve"> as how you found a confidence interval for one mean! </w:t>
-            </w:r>
-          </w:p>
-          <w:p>
-            <w:pPr>
-              <w:jc w:val="center"/>
-              <w:rPr>
-                <w:b/>
-                <w:bCs/>
-                <w:sz w:val="28"/>
-                <w:szCs w:val="28"/>
-              </w:rPr>
-            </w:pPr>
-          </w:p>
-        </w:tc>
-      </w:tr>
-    </w:tbl>
+    <w:p/>
+    <w:p/>
     <w:p/>
     <w:p/>
     <w:p/>

</xml_diff>